<commit_message>
Refatoração na substituição de tags Word por runs e liberação de digitação com barras no campo de processo
</commit_message>
<xml_diff>
--- a/dados/modelo_parecer_deferido_pm.docx
+++ b/dados/modelo_parecer_deferido_pm.docx
@@ -74,8 +74,7 @@
               <w:rPr>
                 <w:rFonts w:ascii="Times New Roman" w:hAnsi="Times New Roman" w:cs="Times New Roman"/>
               </w:rPr>
-              <w:tab/>
-              <w:t xml:space="preserve">           </w:t>
+              <w:t xml:space="preserve">         </w:t>
             </w:r>
             <w:r>
               <w:rPr>
@@ -92,6 +91,12 @@
             <w:r>
               <w:rPr>
                 <w:rFonts w:ascii="Times New Roman" w:hAnsi="Times New Roman" w:cs="Times New Roman"/>
+              </w:rPr>
+              <w:t xml:space="preserve">              </w:t>
+            </w:r>
+            <w:r>
+              <w:rPr>
+                <w:rFonts w:ascii="Times New Roman" w:hAnsi="Times New Roman" w:cs="Times New Roman"/>
                 <w:b/>
               </w:rPr>
               <w:t>DATA:</w:t>
@@ -100,9 +105,10 @@
               <w:rPr>
                 <w:rFonts w:ascii="Times New Roman" w:hAnsi="Times New Roman" w:cs="Times New Roman"/>
               </w:rPr>
-              <w:tab/>
-              <w:t>{{DATA}}.</w:t>
+              <w:t xml:space="preserve"> {{DATA}}</w:t>
             </w:r>
+            <w:bookmarkStart w:id="0" w:name="_GoBack"/>
+            <w:bookmarkEnd w:id="0"/>
           </w:p>
         </w:tc>
       </w:tr>
@@ -135,7 +141,13 @@
               <w:rPr>
                 <w:rFonts w:ascii="Times New Roman" w:hAnsi="Times New Roman" w:cs="Times New Roman"/>
               </w:rPr>
-              <w:t xml:space="preserve"> {{PROCESSO}}.</w:t>
+              <w:t xml:space="preserve"> {{PROCESSO}}</w:t>
+            </w:r>
+            <w:r>
+              <w:rPr>
+                <w:rFonts w:ascii="Times New Roman" w:hAnsi="Times New Roman" w:cs="Times New Roman"/>
+              </w:rPr>
+              <w:t>.</w:t>
             </w:r>
           </w:p>
         </w:tc>
@@ -171,7 +183,13 @@
               <w:rPr>
                 <w:rFonts w:ascii="Times New Roman" w:hAnsi="Times New Roman" w:cs="Times New Roman"/>
               </w:rPr>
-              <w:t xml:space="preserve">{{ASSUNTO}}. </w:t>
+              <w:t>{{ASSUNTO}}</w:t>
+            </w:r>
+            <w:r>
+              <w:rPr>
+                <w:rFonts w:ascii="Times New Roman" w:hAnsi="Times New Roman" w:cs="Times New Roman"/>
+              </w:rPr>
+              <w:t xml:space="preserve">. </w:t>
             </w:r>
           </w:p>
         </w:tc>
@@ -200,7 +218,13 @@
               <w:rPr>
                 <w:rFonts w:ascii="Times New Roman" w:hAnsi="Times New Roman" w:cs="Times New Roman"/>
               </w:rPr>
-              <w:t xml:space="preserve"> {{SOLICITANTE}}. </w:t>
+              <w:t xml:space="preserve"> {{SOLICITANTE}}</w:t>
+            </w:r>
+            <w:r>
+              <w:rPr>
+                <w:rFonts w:ascii="Times New Roman" w:hAnsi="Times New Roman" w:cs="Times New Roman"/>
+              </w:rPr>
+              <w:t xml:space="preserve">. </w:t>
             </w:r>
           </w:p>
         </w:tc>
@@ -241,8 +265,6 @@
           <w:lang w:eastAsia="ar-SA"/>
         </w:rPr>
       </w:pPr>
-      <w:bookmarkStart w:id="0" w:name="_GoBack"/>
-      <w:bookmarkEnd w:id="0"/>
       <w:r>
         <w:rPr>
           <w:rFonts w:ascii="Times New Roman" w:eastAsia="Times New Roman" w:hAnsi="Times New Roman" w:cs="Times New Roman"/>

</xml_diff>